<commit_message>
Add flow diagrams to Word docs; add Stage-B4 Control Check (InfoSec) document
- System Documentation: embed rendered flow diagrams (component/layer
  architecture, data-flow with trust boundary, deployment topology) as
  images, matching the Mermaid diagrams in the markdown source.
- New docs/Manpower-Allocation-Control-Check-B4.docx: the Stage-B4 Control
  Check Document (Security Review Checklist) — per-control STATUS/EVIDENCE
  across all mandatory categories, documented deviations, overall
  self-assessment (READY FOR IT REVIEW), and an IT/InfoSec sign-off block.
  Includes the data-flow / trust-boundary diagram.

Co-Authored-By: Claude Opus 4.8 <noreply@anthropic.com>
Claude-Session: https://claude.ai/code/session_01C2d2dPWQGrvRzjqJLowWwX
</commit_message>
<xml_diff>
--- a/docs/Manpower-Allocation-System-Documentation.docx
+++ b/docs/Manpower-Allocation-System-Documentation.docx
@@ -7410,6 +7410,68 @@
         </w:tc>
       </w:tr>
     </w:tbl>
+    <w:p>
+      <w:pPr>
+        <w:spacing w:after="40" w:before="80"/>
+        <w:jc w:val="center"/>
+      </w:pPr>
+      <w:r>
+        <w:drawing>
+          <wp:inline distT="0" distB="0" distL="0" distR="0">
+            <wp:extent cx="5715000" cy="3000375"/>
+            <wp:effectExtent t="0" r="0" b="0" l="0"/>
+            <wp:docPr id="1" name="" descr="" title=""/>
+            <wp:cNvGraphicFramePr>
+              <a:graphicFrameLocks xmlns:a="http://schemas.openxmlformats.org/drawingml/2006/main" noChangeAspect="1"/>
+            </wp:cNvGraphicFramePr>
+            <a:graphic xmlns:a="http://schemas.openxmlformats.org/drawingml/2006/main">
+              <a:graphicData uri="http://schemas.openxmlformats.org/drawingml/2006/picture">
+                <pic:pic xmlns:pic="http://schemas.openxmlformats.org/drawingml/2006/picture">
+                  <pic:nvPicPr>
+                    <pic:cNvPr id="0" name="" descr=""/>
+                    <pic:cNvPicPr>
+                      <a:picLocks noChangeAspect="1" noChangeArrowheads="1"/>
+                    </pic:cNvPicPr>
+                  </pic:nvPicPr>
+                  <pic:blipFill>
+                    <a:blip r:embed="rId7" cstate="none"/>
+                    <a:srcRect/>
+                    <a:stretch>
+                      <a:fillRect/>
+                    </a:stretch>
+                  </pic:blipFill>
+                  <pic:spPr bwMode="auto">
+                    <a:xfrm>
+                      <a:off x="0" y="0"/>
+                      <a:ext cx="5715000" cy="3000375"/>
+                    </a:xfrm>
+                    <a:prstGeom prst="rect">
+                      <a:avLst/>
+                    </a:prstGeom>
+                  </pic:spPr>
+                </pic:pic>
+              </a:graphicData>
+            </a:graphic>
+          </wp:inline>
+        </w:drawing>
+      </w:r>
+    </w:p>
+    <w:p>
+      <w:pPr>
+        <w:spacing w:after="160"/>
+        <w:jc w:val="center"/>
+      </w:pPr>
+      <w:r>
+        <w:rPr>
+          <w:i/>
+          <w:iCs/>
+          <w:color w:val="666666"/>
+          <w:sz w:val="17"/>
+          <w:szCs w:val="17"/>
+        </w:rPr>
+        <w:t xml:space="preserve">Figure 1 — Component / layer architecture (Clean Architecture; dependencies point inward).</w:t>
+      </w:r>
+    </w:p>
     <w:p>
       <w:pPr>
         <w:pStyle w:val="Heading2"/>
@@ -8533,6 +8595,68 @@
           <w:szCs w:val="21"/>
         </w:rPr>
         <w:t xml:space="preserve">Presence enters only from the biometric view (read-only). Allocation edits and imports enter through authenticated, audited services. Reports leave only to the authenticated user’s browser or to configured email recipients. No PII is written to logs; error responses are generic.</w:t>
+      </w:r>
+    </w:p>
+    <w:p>
+      <w:pPr>
+        <w:spacing w:after="40" w:before="80"/>
+        <w:jc w:val="center"/>
+      </w:pPr>
+      <w:r>
+        <w:drawing>
+          <wp:inline distT="0" distB="0" distL="0" distR="0">
+            <wp:extent cx="5905500" cy="1333500"/>
+            <wp:effectExtent t="0" r="0" b="0" l="0"/>
+            <wp:docPr id="1" name="" descr="" title=""/>
+            <wp:cNvGraphicFramePr>
+              <a:graphicFrameLocks xmlns:a="http://schemas.openxmlformats.org/drawingml/2006/main" noChangeAspect="1"/>
+            </wp:cNvGraphicFramePr>
+            <a:graphic xmlns:a="http://schemas.openxmlformats.org/drawingml/2006/main">
+              <a:graphicData uri="http://schemas.openxmlformats.org/drawingml/2006/picture">
+                <pic:pic xmlns:pic="http://schemas.openxmlformats.org/drawingml/2006/picture">
+                  <pic:nvPicPr>
+                    <pic:cNvPr id="0" name="" descr=""/>
+                    <pic:cNvPicPr>
+                      <a:picLocks noChangeAspect="1" noChangeArrowheads="1"/>
+                    </pic:cNvPicPr>
+                  </pic:nvPicPr>
+                  <pic:blipFill>
+                    <a:blip r:embed="rId8" cstate="none"/>
+                    <a:srcRect/>
+                    <a:stretch>
+                      <a:fillRect/>
+                    </a:stretch>
+                  </pic:blipFill>
+                  <pic:spPr bwMode="auto">
+                    <a:xfrm>
+                      <a:off x="0" y="0"/>
+                      <a:ext cx="5905500" cy="1333500"/>
+                    </a:xfrm>
+                    <a:prstGeom prst="rect">
+                      <a:avLst/>
+                    </a:prstGeom>
+                  </pic:spPr>
+                </pic:pic>
+              </a:graphicData>
+            </a:graphic>
+          </wp:inline>
+        </w:drawing>
+      </w:r>
+    </w:p>
+    <w:p>
+      <w:pPr>
+        <w:spacing w:after="160"/>
+        <w:jc w:val="center"/>
+      </w:pPr>
+      <w:r>
+        <w:rPr>
+          <w:i/>
+          <w:iCs/>
+          <w:color w:val="666666"/>
+          <w:sz w:val="17"/>
+          <w:szCs w:val="17"/>
+        </w:rPr>
+        <w:t xml:space="preserve">Figure 2 — Data-flow diagram with the internal-network trust boundary.</w:t>
       </w:r>
     </w:p>
     <w:p>
@@ -21213,6 +21337,68 @@
       </w:pPr>
       <w:r>
         <w:t xml:space="preserve">8. Deployment runbook</w:t>
+      </w:r>
+    </w:p>
+    <w:p>
+      <w:pPr>
+        <w:spacing w:after="40" w:before="80"/>
+        <w:jc w:val="center"/>
+      </w:pPr>
+      <w:r>
+        <w:drawing>
+          <wp:inline distT="0" distB="0" distL="0" distR="0">
+            <wp:extent cx="5715000" cy="3181350"/>
+            <wp:effectExtent t="0" r="0" b="0" l="0"/>
+            <wp:docPr id="1" name="" descr="" title=""/>
+            <wp:cNvGraphicFramePr>
+              <a:graphicFrameLocks xmlns:a="http://schemas.openxmlformats.org/drawingml/2006/main" noChangeAspect="1"/>
+            </wp:cNvGraphicFramePr>
+            <a:graphic xmlns:a="http://schemas.openxmlformats.org/drawingml/2006/main">
+              <a:graphicData uri="http://schemas.openxmlformats.org/drawingml/2006/picture">
+                <pic:pic xmlns:pic="http://schemas.openxmlformats.org/drawingml/2006/picture">
+                  <pic:nvPicPr>
+                    <pic:cNvPr id="0" name="" descr=""/>
+                    <pic:cNvPicPr>
+                      <a:picLocks noChangeAspect="1" noChangeArrowheads="1"/>
+                    </pic:cNvPicPr>
+                  </pic:nvPicPr>
+                  <pic:blipFill>
+                    <a:blip r:embed="rId9" cstate="none"/>
+                    <a:srcRect/>
+                    <a:stretch>
+                      <a:fillRect/>
+                    </a:stretch>
+                  </pic:blipFill>
+                  <pic:spPr bwMode="auto">
+                    <a:xfrm>
+                      <a:off x="0" y="0"/>
+                      <a:ext cx="5715000" cy="3181350"/>
+                    </a:xfrm>
+                    <a:prstGeom prst="rect">
+                      <a:avLst/>
+                    </a:prstGeom>
+                  </pic:spPr>
+                </pic:pic>
+              </a:graphicData>
+            </a:graphic>
+          </wp:inline>
+        </w:drawing>
+      </w:r>
+    </w:p>
+    <w:p>
+      <w:pPr>
+        <w:spacing w:after="160"/>
+        <w:jc w:val="center"/>
+      </w:pPr>
+      <w:r>
+        <w:rPr>
+          <w:i/>
+          <w:iCs/>
+          <w:color w:val="666666"/>
+          <w:sz w:val="17"/>
+          <w:szCs w:val="17"/>
+        </w:rPr>
+        <w:t xml:space="preserve">Figure 3 — Deployment topology (IIS-hosted; two least-privilege SQL logins; Entra ID and Office 365).</w:t>
       </w:r>
     </w:p>
     <w:p>

</xml_diff>